<commit_message>
learnt and practiced about categorical data and polynomial regression
</commit_message>
<xml_diff>
--- a/Ouputpdf/ml_L1_EashaKadganve.docx
+++ b/Ouputpdf/ml_L1_EashaKadganve.docx
@@ -33,10 +33,8 @@
           <w:lang w:val="en-US"/>
         </w:rPr>
         <w:tab/>
-        <w:t>Machine Learning-Lecture 1</w:t>
-      </w:r>
-      <w:bookmarkStart w:id="0" w:name="_GoBack"/>
-      <w:bookmarkEnd w:id="0"/>
+        <w:t>Machine Learning-Lecture 4</w:t>
+      </w:r>
     </w:p>
     <w:p>
       <w:pPr>
@@ -66,8 +64,8 @@
           <w:lang w:val="en-US"/>
         </w:rPr>
         <w:drawing>
-          <wp:inline distT="0" distB="0" distL="0" distR="0" wp14:anchorId="4E7BF452" wp14:editId="00427AD6">
-            <wp:extent cx="5731510" cy="2713355"/>
+          <wp:inline distT="0" distB="0" distL="0" distR="0" wp14:anchorId="6635A45A" wp14:editId="3F20AF14">
+            <wp:extent cx="5731510" cy="3352800"/>
             <wp:effectExtent l="0" t="0" r="2540" b="0"/>
             <wp:docPr id="1" name="Picture 1"/>
             <wp:cNvGraphicFramePr>
@@ -80,20 +78,27 @@
                     <pic:cNvPr id="1" name=""/>
                     <pic:cNvPicPr/>
                   </pic:nvPicPr>
-                  <pic:blipFill>
-                    <a:blip r:embed="rId4"/>
-                    <a:stretch>
-                      <a:fillRect/>
-                    </a:stretch>
+                  <pic:blipFill rotWithShape="1">
+                    <a:blip r:embed="rId6"/>
+                    <a:srcRect b="-144"/>
+                    <a:stretch/>
                   </pic:blipFill>
-                  <pic:spPr>
+                  <pic:spPr bwMode="auto">
                     <a:xfrm>
                       <a:off x="0" y="0"/>
-                      <a:ext cx="5731510" cy="2713355"/>
+                      <a:ext cx="5731510" cy="3352800"/>
                     </a:xfrm>
                     <a:prstGeom prst="rect">
                       <a:avLst/>
                     </a:prstGeom>
+                    <a:ln>
+                      <a:noFill/>
+                    </a:ln>
+                    <a:extLst>
+                      <a:ext uri="{53640926-AAD7-44D8-BBD7-CCE9431645EC}">
+                        <a14:shadowObscured xmlns:a14="http://schemas.microsoft.com/office/drawing/2010/main"/>
+                      </a:ext>
+                    </a:extLst>
                   </pic:spPr>
                 </pic:pic>
               </a:graphicData>
@@ -136,47 +141,659 @@
         <w:rPr>
           <w:lang w:val="en-US"/>
         </w:rPr>
-        <w:t>C:\ml\L1&gt;python p2.py</w:t>
-      </w:r>
-    </w:p>
-    <w:p>
-      <w:pPr>
-        <w:rPr>
-          <w:lang w:val="en-US"/>
-        </w:rPr>
-      </w:pPr>
-      <w:r>
-        <w:rPr>
-          <w:lang w:val="en-US"/>
-        </w:rPr>
-        <w:t>Enter Area 3.0</w:t>
-      </w:r>
-    </w:p>
-    <w:p>
-      <w:pPr>
-        <w:rPr>
-          <w:lang w:val="en-US"/>
-        </w:rPr>
-      </w:pPr>
-      <w:r>
-        <w:rPr>
-          <w:lang w:val="en-US"/>
-        </w:rPr>
-        <w:t xml:space="preserve">price </w:t>
-      </w:r>
-      <w:proofErr w:type="gramStart"/>
-      <w:r>
-        <w:rPr>
-          <w:lang w:val="en-US"/>
-        </w:rPr>
-        <w:t>=  [</w:t>
-      </w:r>
-      <w:proofErr w:type="gramEnd"/>
-      <w:r>
-        <w:rPr>
-          <w:lang w:val="en-US"/>
-        </w:rPr>
-        <w:t>5.87842466]</w:t>
+        <w:t>C:\ml\L4&gt;python p2.py</w:t>
+      </w:r>
+    </w:p>
+    <w:p>
+      <w:pPr>
+        <w:rPr>
+          <w:lang w:val="en-US"/>
+        </w:rPr>
+      </w:pPr>
+      <w:r>
+        <w:rPr>
+          <w:lang w:val="en-US"/>
+        </w:rPr>
+        <w:t>Traceback (most recent call last):</w:t>
+      </w:r>
+    </w:p>
+    <w:p>
+      <w:pPr>
+        <w:rPr>
+          <w:lang w:val="en-US"/>
+        </w:rPr>
+      </w:pPr>
+      <w:r>
+        <w:rPr>
+          <w:lang w:val="en-US"/>
+        </w:rPr>
+        <w:t xml:space="preserve">  File "C:\ml\L4\p2.py", line 10, in &lt;module&gt;</w:t>
+      </w:r>
+    </w:p>
+    <w:p>
+      <w:pPr>
+        <w:rPr>
+          <w:lang w:val="en-US"/>
+        </w:rPr>
+      </w:pPr>
+      <w:r>
+        <w:rPr>
+          <w:lang w:val="en-US"/>
+        </w:rPr>
+        <w:t xml:space="preserve">    model.fit(feature.values,target)</w:t>
+      </w:r>
+    </w:p>
+    <w:p>
+      <w:pPr>
+        <w:rPr>
+          <w:lang w:val="en-US"/>
+        </w:rPr>
+      </w:pPr>
+      <w:r>
+        <w:rPr>
+          <w:lang w:val="en-US"/>
+        </w:rPr>
+        <w:t xml:space="preserve">    ~~~~~~~~~^^^^^^^^^^^^^^^^^^^^^^^</w:t>
+      </w:r>
+    </w:p>
+    <w:p>
+      <w:pPr>
+        <w:rPr>
+          <w:lang w:val="en-US"/>
+        </w:rPr>
+      </w:pPr>
+      <w:r>
+        <w:rPr>
+          <w:lang w:val="en-US"/>
+        </w:rPr>
+        <w:t xml:space="preserve">  File "C:\Users\COMP\AppData\Roaming\Python\Python313\site-packages\sklearn\base.py", line 1365, in wrapper</w:t>
+      </w:r>
+    </w:p>
+    <w:p>
+      <w:pPr>
+        <w:rPr>
+          <w:lang w:val="en-US"/>
+        </w:rPr>
+      </w:pPr>
+      <w:r>
+        <w:rPr>
+          <w:lang w:val="en-US"/>
+        </w:rPr>
+        <w:t xml:space="preserve">    return fit_method(estimator, *args, **kwargs)</w:t>
+      </w:r>
+    </w:p>
+    <w:p>
+      <w:pPr>
+        <w:rPr>
+          <w:lang w:val="en-US"/>
+        </w:rPr>
+      </w:pPr>
+      <w:r>
+        <w:rPr>
+          <w:lang w:val="en-US"/>
+        </w:rPr>
+        <w:t xml:space="preserve">  File "C:\Users\COMP\AppData\Roaming\Python\Python313\site-packages\sklearn\linear_model\_base.py", line 618, in fit</w:t>
+      </w:r>
+    </w:p>
+    <w:p>
+      <w:pPr>
+        <w:rPr>
+          <w:lang w:val="en-US"/>
+        </w:rPr>
+      </w:pPr>
+      <w:r>
+        <w:rPr>
+          <w:lang w:val="en-US"/>
+        </w:rPr>
+        <w:t xml:space="preserve">    X, y = validate_data(</w:t>
+      </w:r>
+    </w:p>
+    <w:p>
+      <w:pPr>
+        <w:rPr>
+          <w:lang w:val="en-US"/>
+        </w:rPr>
+      </w:pPr>
+      <w:r>
+        <w:rPr>
+          <w:lang w:val="en-US"/>
+        </w:rPr>
+        <w:t xml:space="preserve">           ~~~~~~~~~~~~~^</w:t>
+      </w:r>
+    </w:p>
+    <w:p>
+      <w:pPr>
+        <w:rPr>
+          <w:lang w:val="en-US"/>
+        </w:rPr>
+      </w:pPr>
+      <w:r>
+        <w:rPr>
+          <w:lang w:val="en-US"/>
+        </w:rPr>
+        <w:t xml:space="preserve">        self,</w:t>
+      </w:r>
+    </w:p>
+    <w:p>
+      <w:pPr>
+        <w:rPr>
+          <w:lang w:val="en-US"/>
+        </w:rPr>
+      </w:pPr>
+      <w:r>
+        <w:rPr>
+          <w:lang w:val="en-US"/>
+        </w:rPr>
+        <w:t xml:space="preserve">        ^^^^^</w:t>
+      </w:r>
+    </w:p>
+    <w:p>
+      <w:pPr>
+        <w:rPr>
+          <w:lang w:val="en-US"/>
+        </w:rPr>
+      </w:pPr>
+      <w:r>
+        <w:rPr>
+          <w:lang w:val="en-US"/>
+        </w:rPr>
+        <w:t xml:space="preserve">    ...&lt;5 lines&gt;...</w:t>
+      </w:r>
+    </w:p>
+    <w:p>
+      <w:pPr>
+        <w:rPr>
+          <w:lang w:val="en-US"/>
+        </w:rPr>
+      </w:pPr>
+      <w:r>
+        <w:rPr>
+          <w:lang w:val="en-US"/>
+        </w:rPr>
+        <w:t xml:space="preserve">        force_writeable=True,</w:t>
+      </w:r>
+    </w:p>
+    <w:p>
+      <w:pPr>
+        <w:rPr>
+          <w:lang w:val="en-US"/>
+        </w:rPr>
+      </w:pPr>
+      <w:r>
+        <w:rPr>
+          <w:lang w:val="en-US"/>
+        </w:rPr>
+        <w:lastRenderedPageBreak/>
+        <w:t xml:space="preserve">        ^^^^^^^^^^^^^^^^^^^^^</w:t>
+      </w:r>
+    </w:p>
+    <w:p>
+      <w:pPr>
+        <w:rPr>
+          <w:lang w:val="en-US"/>
+        </w:rPr>
+      </w:pPr>
+      <w:r>
+        <w:rPr>
+          <w:lang w:val="en-US"/>
+        </w:rPr>
+        <w:t xml:space="preserve">    )</w:t>
+      </w:r>
+    </w:p>
+    <w:p>
+      <w:pPr>
+        <w:rPr>
+          <w:lang w:val="en-US"/>
+        </w:rPr>
+      </w:pPr>
+      <w:r>
+        <w:rPr>
+          <w:lang w:val="en-US"/>
+        </w:rPr>
+        <w:t xml:space="preserve">    ^</w:t>
+      </w:r>
+    </w:p>
+    <w:p>
+      <w:pPr>
+        <w:rPr>
+          <w:lang w:val="en-US"/>
+        </w:rPr>
+      </w:pPr>
+      <w:r>
+        <w:rPr>
+          <w:lang w:val="en-US"/>
+        </w:rPr>
+        <w:t xml:space="preserve">  File "C:\Users\COMP\AppData\Roaming\Python\Python313\site-packages\sklearn\utils\validation.py", line 2971, in validate_data</w:t>
+      </w:r>
+    </w:p>
+    <w:p>
+      <w:pPr>
+        <w:rPr>
+          <w:lang w:val="en-US"/>
+        </w:rPr>
+      </w:pPr>
+      <w:r>
+        <w:rPr>
+          <w:lang w:val="en-US"/>
+        </w:rPr>
+        <w:t xml:space="preserve">    X, y = check_X_y(X, y, **check_params)</w:t>
+      </w:r>
+    </w:p>
+    <w:p>
+      <w:pPr>
+        <w:rPr>
+          <w:lang w:val="en-US"/>
+        </w:rPr>
+      </w:pPr>
+      <w:r>
+        <w:rPr>
+          <w:lang w:val="en-US"/>
+        </w:rPr>
+        <w:t xml:space="preserve">           ~~~~~~~~~^^^^^^^^^^^^^^^^^^^^^^</w:t>
+      </w:r>
+    </w:p>
+    <w:p>
+      <w:pPr>
+        <w:rPr>
+          <w:lang w:val="en-US"/>
+        </w:rPr>
+      </w:pPr>
+      <w:r>
+        <w:rPr>
+          <w:lang w:val="en-US"/>
+        </w:rPr>
+        <w:t xml:space="preserve">  File "C:\Users\COMP\AppData\Roaming\Python\Python313\site-packages\sklearn\utils\validation.py", line 1385, in check_X_y</w:t>
+      </w:r>
+    </w:p>
+    <w:p>
+      <w:pPr>
+        <w:rPr>
+          <w:lang w:val="en-US"/>
+        </w:rPr>
+      </w:pPr>
+      <w:r>
+        <w:rPr>
+          <w:lang w:val="en-US"/>
+        </w:rPr>
+        <w:t xml:space="preserve">    y = _check_y(y, multi_output=multi_output, y_numeric=y_numeric, estimator=estimator)</w:t>
+      </w:r>
+    </w:p>
+    <w:p>
+      <w:pPr>
+        <w:rPr>
+          <w:lang w:val="en-US"/>
+        </w:rPr>
+      </w:pPr>
+      <w:r>
+        <w:rPr>
+          <w:lang w:val="en-US"/>
+        </w:rPr>
+        <w:t xml:space="preserve">  File "C:\Users\COMP\AppData\Roaming\Python\Python313\site-packages\sklearn\utils\validation.py", line 1395, in _check_y</w:t>
+      </w:r>
+    </w:p>
+    <w:p>
+      <w:pPr>
+        <w:rPr>
+          <w:lang w:val="en-US"/>
+        </w:rPr>
+      </w:pPr>
+      <w:r>
+        <w:rPr>
+          <w:lang w:val="en-US"/>
+        </w:rPr>
+        <w:t xml:space="preserve">    y = check_array(</w:t>
+      </w:r>
+    </w:p>
+    <w:p>
+      <w:pPr>
+        <w:rPr>
+          <w:lang w:val="en-US"/>
+        </w:rPr>
+      </w:pPr>
+      <w:r>
+        <w:rPr>
+          <w:lang w:val="en-US"/>
+        </w:rPr>
+        <w:t xml:space="preserve">        y,</w:t>
+      </w:r>
+    </w:p>
+    <w:p>
+      <w:pPr>
+        <w:rPr>
+          <w:lang w:val="en-US"/>
+        </w:rPr>
+      </w:pPr>
+      <w:r>
+        <w:rPr>
+          <w:lang w:val="en-US"/>
+        </w:rPr>
+        <w:t xml:space="preserve">    ...&lt;5 lines&gt;...</w:t>
+      </w:r>
+    </w:p>
+    <w:p>
+      <w:pPr>
+        <w:rPr>
+          <w:lang w:val="en-US"/>
+        </w:rPr>
+      </w:pPr>
+      <w:r>
+        <w:rPr>
+          <w:lang w:val="en-US"/>
+        </w:rPr>
+        <w:t xml:space="preserve">        estimator=estimator,</w:t>
+      </w:r>
+    </w:p>
+    <w:p>
+      <w:pPr>
+        <w:rPr>
+          <w:lang w:val="en-US"/>
+        </w:rPr>
+      </w:pPr>
+      <w:r>
+        <w:rPr>
+          <w:lang w:val="en-US"/>
+        </w:rPr>
+        <w:t xml:space="preserve">    )</w:t>
+      </w:r>
+    </w:p>
+    <w:p>
+      <w:pPr>
+        <w:rPr>
+          <w:lang w:val="en-US"/>
+        </w:rPr>
+      </w:pPr>
+      <w:r>
+        <w:rPr>
+          <w:lang w:val="en-US"/>
+        </w:rPr>
+        <w:t xml:space="preserve">  File "C:\Users\COMP\AppData\Roaming\Python\Python313\site-packages\sklearn\utils\validation.py", line 1105, in check_array</w:t>
+      </w:r>
+    </w:p>
+    <w:p>
+      <w:pPr>
+        <w:rPr>
+          <w:lang w:val="en-US"/>
+        </w:rPr>
+      </w:pPr>
+      <w:r>
+        <w:rPr>
+          <w:lang w:val="en-US"/>
+        </w:rPr>
+        <w:t xml:space="preserve">    _assert_all_finite(</w:t>
+      </w:r>
+    </w:p>
+    <w:p>
+      <w:pPr>
+        <w:rPr>
+          <w:lang w:val="en-US"/>
+        </w:rPr>
+      </w:pPr>
+      <w:r>
+        <w:rPr>
+          <w:lang w:val="en-US"/>
+        </w:rPr>
+        <w:t xml:space="preserve">    ~~~~~~~~~~~~~~~~~~^</w:t>
+      </w:r>
+    </w:p>
+    <w:p>
+      <w:pPr>
+        <w:rPr>
+          <w:lang w:val="en-US"/>
+        </w:rPr>
+      </w:pPr>
+      <w:r>
+        <w:rPr>
+          <w:lang w:val="en-US"/>
+        </w:rPr>
+        <w:t xml:space="preserve">        array,</w:t>
+      </w:r>
+    </w:p>
+    <w:p>
+      <w:pPr>
+        <w:rPr>
+          <w:lang w:val="en-US"/>
+        </w:rPr>
+      </w:pPr>
+      <w:r>
+        <w:rPr>
+          <w:lang w:val="en-US"/>
+        </w:rPr>
+        <w:t xml:space="preserve">        ^^^^^^</w:t>
+      </w:r>
+    </w:p>
+    <w:p>
+      <w:pPr>
+        <w:rPr>
+          <w:lang w:val="en-US"/>
+        </w:rPr>
+      </w:pPr>
+      <w:r>
+        <w:rPr>
+          <w:lang w:val="en-US"/>
+        </w:rPr>
+        <w:t xml:space="preserve">    ...&lt;2 lines&gt;...</w:t>
+      </w:r>
+    </w:p>
+    <w:p>
+      <w:pPr>
+        <w:rPr>
+          <w:lang w:val="en-US"/>
+        </w:rPr>
+      </w:pPr>
+      <w:r>
+        <w:rPr>
+          <w:lang w:val="en-US"/>
+        </w:rPr>
+        <w:t xml:space="preserve">        allow_nan=ensure_all_finite == "allow-nan",</w:t>
+      </w:r>
+    </w:p>
+    <w:p>
+      <w:pPr>
+        <w:rPr>
+          <w:lang w:val="en-US"/>
+        </w:rPr>
+      </w:pPr>
+      <w:r>
+        <w:rPr>
+          <w:lang w:val="en-US"/>
+        </w:rPr>
+        <w:t xml:space="preserve">        ^^^^^^^^^^^^^^^^^^^^^^^^^^^^^^^^^^^^^^^^^^^</w:t>
+      </w:r>
+    </w:p>
+    <w:p>
+      <w:pPr>
+        <w:rPr>
+          <w:lang w:val="en-US"/>
+        </w:rPr>
+      </w:pPr>
+      <w:r>
+        <w:rPr>
+          <w:lang w:val="en-US"/>
+        </w:rPr>
+        <w:t xml:space="preserve">    )</w:t>
+      </w:r>
+    </w:p>
+    <w:p>
+      <w:pPr>
+        <w:rPr>
+          <w:lang w:val="en-US"/>
+        </w:rPr>
+      </w:pPr>
+      <w:r>
+        <w:rPr>
+          <w:lang w:val="en-US"/>
+        </w:rPr>
+        <w:t xml:space="preserve">    ^</w:t>
+      </w:r>
+    </w:p>
+    <w:p>
+      <w:pPr>
+        <w:rPr>
+          <w:lang w:val="en-US"/>
+        </w:rPr>
+      </w:pPr>
+      <w:r>
+        <w:rPr>
+          <w:lang w:val="en-US"/>
+        </w:rPr>
+        <w:t xml:space="preserve">  File "C:\Users\COMP\AppData\Roaming\Python\Python313\site-packages\sklearn\utils\validation.py", line 120, in _assert_all_finite</w:t>
+      </w:r>
+    </w:p>
+    <w:p>
+      <w:pPr>
+        <w:rPr>
+          <w:lang w:val="en-US"/>
+        </w:rPr>
+      </w:pPr>
+      <w:r>
+        <w:rPr>
+          <w:lang w:val="en-US"/>
+        </w:rPr>
+        <w:t xml:space="preserve">    _assert_all_finite_element_wise(</w:t>
+      </w:r>
+    </w:p>
+    <w:p>
+      <w:pPr>
+        <w:rPr>
+          <w:lang w:val="en-US"/>
+        </w:rPr>
+      </w:pPr>
+      <w:r>
+        <w:rPr>
+          <w:lang w:val="en-US"/>
+        </w:rPr>
+        <w:t xml:space="preserve">    ~~~~~~~~~~~~~~~~~~~~~~~~~~~~~~~^</w:t>
+      </w:r>
+    </w:p>
+    <w:p>
+      <w:pPr>
+        <w:rPr>
+          <w:lang w:val="en-US"/>
+        </w:rPr>
+      </w:pPr>
+      <w:r>
+        <w:rPr>
+          <w:lang w:val="en-US"/>
+        </w:rPr>
+        <w:t xml:space="preserve">        X,</w:t>
+      </w:r>
+    </w:p>
+    <w:p>
+      <w:pPr>
+        <w:rPr>
+          <w:lang w:val="en-US"/>
+        </w:rPr>
+      </w:pPr>
+      <w:r>
+        <w:rPr>
+          <w:lang w:val="en-US"/>
+        </w:rPr>
+        <w:lastRenderedPageBreak/>
+        <w:t xml:space="preserve">        ^^</w:t>
+      </w:r>
+    </w:p>
+    <w:p>
+      <w:pPr>
+        <w:rPr>
+          <w:lang w:val="en-US"/>
+        </w:rPr>
+      </w:pPr>
+      <w:r>
+        <w:rPr>
+          <w:lang w:val="en-US"/>
+        </w:rPr>
+        <w:t xml:space="preserve">    ...&lt;4 lines&gt;...</w:t>
+      </w:r>
+    </w:p>
+    <w:p>
+      <w:pPr>
+        <w:rPr>
+          <w:lang w:val="en-US"/>
+        </w:rPr>
+      </w:pPr>
+      <w:r>
+        <w:rPr>
+          <w:lang w:val="en-US"/>
+        </w:rPr>
+        <w:t xml:space="preserve">        input_name=input_name,</w:t>
+      </w:r>
+    </w:p>
+    <w:p>
+      <w:pPr>
+        <w:rPr>
+          <w:lang w:val="en-US"/>
+        </w:rPr>
+      </w:pPr>
+      <w:r>
+        <w:rPr>
+          <w:lang w:val="en-US"/>
+        </w:rPr>
+        <w:t xml:space="preserve">        ^^^^^^^^^^^^^^^^^^^^^^</w:t>
+      </w:r>
+    </w:p>
+    <w:p>
+      <w:pPr>
+        <w:rPr>
+          <w:lang w:val="en-US"/>
+        </w:rPr>
+      </w:pPr>
+      <w:r>
+        <w:rPr>
+          <w:lang w:val="en-US"/>
+        </w:rPr>
+        <w:t xml:space="preserve">    )</w:t>
+      </w:r>
+    </w:p>
+    <w:p>
+      <w:pPr>
+        <w:rPr>
+          <w:lang w:val="en-US"/>
+        </w:rPr>
+      </w:pPr>
+      <w:r>
+        <w:rPr>
+          <w:lang w:val="en-US"/>
+        </w:rPr>
+        <w:t xml:space="preserve">    ^</w:t>
+      </w:r>
+    </w:p>
+    <w:p>
+      <w:pPr>
+        <w:rPr>
+          <w:lang w:val="en-US"/>
+        </w:rPr>
+      </w:pPr>
+      <w:r>
+        <w:rPr>
+          <w:lang w:val="en-US"/>
+        </w:rPr>
+        <w:t xml:space="preserve">  File "C:\Users\COMP\AppData\Roaming\Python\Python313\site-packages\sklearn\utils\validation.py", line 169, in _assert_all_finite_element_wise</w:t>
+      </w:r>
+    </w:p>
+    <w:p>
+      <w:pPr>
+        <w:rPr>
+          <w:lang w:val="en-US"/>
+        </w:rPr>
+      </w:pPr>
+      <w:r>
+        <w:rPr>
+          <w:lang w:val="en-US"/>
+        </w:rPr>
+        <w:t xml:space="preserve">    raise ValueError(msg_err)</w:t>
+      </w:r>
+    </w:p>
+    <w:p>
+      <w:pPr>
+        <w:rPr>
+          <w:lang w:val="en-US"/>
+        </w:rPr>
+      </w:pPr>
+      <w:r>
+        <w:rPr>
+          <w:lang w:val="en-US"/>
+        </w:rPr>
+        <w:t>ValueError: Input y contains NaN.</w:t>
       </w:r>
     </w:p>
     <w:p>
@@ -213,11 +830,1032 @@
         <w:rPr>
           <w:lang w:val="en-US"/>
         </w:rPr>
+        <w:t>C:\ml\L4&gt;python p3.py</w:t>
+      </w:r>
+    </w:p>
+    <w:p>
+      <w:pPr>
+        <w:rPr>
+          <w:lang w:val="en-US"/>
+        </w:rPr>
+      </w:pPr>
+      <w:r>
+        <w:rPr>
+          <w:lang w:val="en-US"/>
+        </w:rPr>
+        <w:t xml:space="preserve">     qty  price</w:t>
+      </w:r>
+    </w:p>
+    <w:p>
+      <w:pPr>
+        <w:rPr>
+          <w:lang w:val="en-US"/>
+        </w:rPr>
+      </w:pPr>
+      <w:r>
+        <w:rPr>
+          <w:lang w:val="en-US"/>
+        </w:rPr>
+        <w:t>0  False  False</w:t>
+      </w:r>
+    </w:p>
+    <w:p>
+      <w:pPr>
+        <w:rPr>
+          <w:lang w:val="en-US"/>
+        </w:rPr>
+      </w:pPr>
+      <w:r>
+        <w:rPr>
+          <w:lang w:val="en-US"/>
+        </w:rPr>
+        <w:t>1  False  False</w:t>
+      </w:r>
+    </w:p>
+    <w:p>
+      <w:pPr>
+        <w:rPr>
+          <w:lang w:val="en-US"/>
+        </w:rPr>
+      </w:pPr>
+      <w:r>
+        <w:rPr>
+          <w:lang w:val="en-US"/>
+        </w:rPr>
+        <w:t>2  False  False</w:t>
+      </w:r>
+    </w:p>
+    <w:p>
+      <w:pPr>
+        <w:rPr>
+          <w:lang w:val="en-US"/>
+        </w:rPr>
+      </w:pPr>
+      <w:r>
+        <w:rPr>
+          <w:lang w:val="en-US"/>
+        </w:rPr>
+        <w:t>3  False   True</w:t>
+      </w:r>
+    </w:p>
+    <w:p>
+      <w:pPr>
+        <w:rPr>
+          <w:lang w:val="en-US"/>
+        </w:rPr>
+      </w:pPr>
+      <w:r>
+        <w:rPr>
+          <w:lang w:val="en-US"/>
+        </w:rPr>
+        <w:t>4  False  False</w:t>
+      </w:r>
+    </w:p>
+    <w:p>
+      <w:pPr>
+        <w:rPr>
+          <w:lang w:val="en-US"/>
+        </w:rPr>
+      </w:pPr>
+      <w:r>
+        <w:rPr>
+          <w:lang w:val="en-US"/>
+        </w:rPr>
+        <w:t>qty      0</w:t>
+      </w:r>
+    </w:p>
+    <w:p>
+      <w:pPr>
+        <w:rPr>
+          <w:lang w:val="en-US"/>
+        </w:rPr>
+      </w:pPr>
+      <w:r>
+        <w:rPr>
+          <w:lang w:val="en-US"/>
+        </w:rPr>
+        <w:t>price    1</w:t>
+      </w:r>
+    </w:p>
+    <w:p>
+      <w:pPr>
+        <w:rPr>
+          <w:lang w:val="en-US"/>
+        </w:rPr>
+      </w:pPr>
+      <w:r>
+        <w:rPr>
+          <w:lang w:val="en-US"/>
+        </w:rPr>
+        <w:t>dtype: int64</w:t>
+      </w:r>
+    </w:p>
+    <w:p>
+      <w:pPr>
+        <w:rPr>
+          <w:lang w:val="en-US"/>
+        </w:rPr>
+      </w:pPr>
+    </w:p>
+    <w:p>
+      <w:pPr>
+        <w:rPr>
+          <w:b/>
+          <w:bCs/>
+          <w:lang w:val="en-US"/>
+        </w:rPr>
+      </w:pPr>
+      <w:r>
+        <w:rPr>
+          <w:b/>
+          <w:bCs/>
+          <w:lang w:val="en-US"/>
+        </w:rPr>
+        <w:t>P4.py</w:t>
+      </w:r>
+    </w:p>
+    <w:p>
+      <w:pPr>
+        <w:rPr>
+          <w:lang w:val="en-US"/>
+        </w:rPr>
+      </w:pPr>
+      <w:r>
+        <w:rPr>
+          <w:lang w:val="en-US"/>
+        </w:rPr>
+        <w:t>C:\ml\L4&gt;python p4.py</w:t>
+      </w:r>
+    </w:p>
+    <w:p>
+      <w:pPr>
+        <w:rPr>
+          <w:lang w:val="en-US"/>
+        </w:rPr>
+      </w:pPr>
+      <w:r>
+        <w:rPr>
+          <w:lang w:val="en-US"/>
+        </w:rPr>
+        <w:t xml:space="preserve">   qty  price</w:t>
+      </w:r>
+    </w:p>
+    <w:p>
+      <w:pPr>
+        <w:rPr>
+          <w:lang w:val="en-US"/>
+        </w:rPr>
+      </w:pPr>
+      <w:r>
+        <w:rPr>
+          <w:lang w:val="en-US"/>
+        </w:rPr>
+        <w:t>0    1    3.5</w:t>
+      </w:r>
+    </w:p>
+    <w:p>
+      <w:pPr>
+        <w:rPr>
+          <w:lang w:val="en-US"/>
+        </w:rPr>
+      </w:pPr>
+      <w:r>
+        <w:rPr>
+          <w:lang w:val="en-US"/>
+        </w:rPr>
+        <w:t>1    2    5.0</w:t>
+      </w:r>
+    </w:p>
+    <w:p>
+      <w:pPr>
+        <w:rPr>
+          <w:lang w:val="en-US"/>
+        </w:rPr>
+      </w:pPr>
+      <w:r>
+        <w:rPr>
+          <w:lang w:val="en-US"/>
+        </w:rPr>
+        <w:t>2    3    6.5</w:t>
+      </w:r>
+    </w:p>
+    <w:p>
+      <w:pPr>
+        <w:rPr>
+          <w:lang w:val="en-US"/>
+        </w:rPr>
+      </w:pPr>
+      <w:r>
+        <w:rPr>
+          <w:lang w:val="en-US"/>
+        </w:rPr>
+        <w:t>3    4    NaN</w:t>
+      </w:r>
+    </w:p>
+    <w:p>
+      <w:pPr>
+        <w:rPr>
+          <w:lang w:val="en-US"/>
+        </w:rPr>
+      </w:pPr>
+      <w:r>
+        <w:rPr>
+          <w:lang w:val="en-US"/>
+        </w:rPr>
+        <w:t>4    5    9.0</w:t>
+      </w:r>
+    </w:p>
+    <w:p>
+      <w:pPr>
+        <w:rPr>
+          <w:lang w:val="en-US"/>
+        </w:rPr>
+      </w:pPr>
+      <w:r>
+        <w:rPr>
+          <w:lang w:val="en-US"/>
+        </w:rPr>
+        <w:lastRenderedPageBreak/>
+        <w:t>qty      0</w:t>
+      </w:r>
+    </w:p>
+    <w:p>
+      <w:pPr>
+        <w:rPr>
+          <w:lang w:val="en-US"/>
+        </w:rPr>
+      </w:pPr>
+      <w:r>
+        <w:rPr>
+          <w:lang w:val="en-US"/>
+        </w:rPr>
+        <w:t>price    1</w:t>
+      </w:r>
+    </w:p>
+    <w:p>
+      <w:pPr>
+        <w:rPr>
+          <w:lang w:val="en-US"/>
+        </w:rPr>
+      </w:pPr>
+      <w:r>
+        <w:rPr>
+          <w:lang w:val="en-US"/>
+        </w:rPr>
+        <w:t>dtype: int64</w:t>
+      </w:r>
+    </w:p>
+    <w:p>
+      <w:pPr>
+        <w:rPr>
+          <w:lang w:val="en-US"/>
+        </w:rPr>
+      </w:pPr>
+      <w:r>
+        <w:rPr>
+          <w:lang w:val="en-US"/>
+        </w:rPr>
+        <w:t>qty      0</w:t>
+      </w:r>
+    </w:p>
+    <w:p>
+      <w:pPr>
+        <w:rPr>
+          <w:lang w:val="en-US"/>
+        </w:rPr>
+      </w:pPr>
+      <w:r>
+        <w:rPr>
+          <w:lang w:val="en-US"/>
+        </w:rPr>
+        <w:t>price    0</w:t>
+      </w:r>
+    </w:p>
+    <w:p>
+      <w:pPr>
+        <w:rPr>
+          <w:lang w:val="en-US"/>
+        </w:rPr>
+      </w:pPr>
+      <w:r>
+        <w:rPr>
+          <w:lang w:val="en-US"/>
+        </w:rPr>
+        <w:t>dtype: int64</w:t>
+      </w:r>
+    </w:p>
+    <w:p>
+      <w:pPr>
+        <w:rPr>
+          <w:lang w:val="en-US"/>
+        </w:rPr>
+      </w:pPr>
+      <w:r>
+        <w:rPr>
+          <w:lang w:val="en-US"/>
+        </w:rPr>
+        <w:t xml:space="preserve">   qty  price</w:t>
+      </w:r>
+    </w:p>
+    <w:p>
+      <w:pPr>
+        <w:rPr>
+          <w:lang w:val="en-US"/>
+        </w:rPr>
+      </w:pPr>
+      <w:r>
+        <w:rPr>
+          <w:lang w:val="en-US"/>
+        </w:rPr>
+        <w:t>0    1    3.5</w:t>
+      </w:r>
+    </w:p>
+    <w:p>
+      <w:pPr>
+        <w:rPr>
+          <w:lang w:val="en-US"/>
+        </w:rPr>
+      </w:pPr>
+      <w:r>
+        <w:rPr>
+          <w:lang w:val="en-US"/>
+        </w:rPr>
+        <w:t>1    2    5.0</w:t>
+      </w:r>
+    </w:p>
+    <w:p>
+      <w:pPr>
+        <w:rPr>
+          <w:lang w:val="en-US"/>
+        </w:rPr>
+      </w:pPr>
+      <w:r>
+        <w:rPr>
+          <w:lang w:val="en-US"/>
+        </w:rPr>
+        <w:t>2    3    6.5</w:t>
+      </w:r>
+    </w:p>
+    <w:p>
+      <w:pPr>
+        <w:rPr>
+          <w:lang w:val="en-US"/>
+        </w:rPr>
+      </w:pPr>
+      <w:r>
+        <w:rPr>
+          <w:lang w:val="en-US"/>
+        </w:rPr>
+        <w:t>4    5    9.0</w:t>
+      </w:r>
+    </w:p>
+    <w:p>
+      <w:pPr>
+        <w:rPr>
+          <w:lang w:val="en-US"/>
+        </w:rPr>
+      </w:pPr>
+      <w:r>
+        <w:rPr>
+          <w:lang w:val="en-US"/>
+        </w:rPr>
+        <w:t>enter qty 4</w:t>
+      </w:r>
+    </w:p>
+    <w:p>
+      <w:pPr>
+        <w:rPr>
+          <w:lang w:val="en-US"/>
+        </w:rPr>
+      </w:pPr>
+      <w:r>
+        <w:rPr>
+          <w:lang w:val="en-US"/>
+        </w:rPr>
+        <w:t>[7.71428571]</w:t>
+      </w:r>
+    </w:p>
+    <w:p>
+      <w:pPr>
+        <w:rPr>
+          <w:lang w:val="en-US"/>
+        </w:rPr>
+      </w:pPr>
+    </w:p>
+    <w:p>
+      <w:pPr>
+        <w:rPr>
+          <w:b/>
+          <w:bCs/>
+          <w:lang w:val="en-US"/>
+        </w:rPr>
+      </w:pPr>
+      <w:r>
+        <w:rPr>
+          <w:b/>
+          <w:bCs/>
+          <w:lang w:val="en-US"/>
+        </w:rPr>
+        <w:t>P5.py</w:t>
+      </w:r>
+    </w:p>
+    <w:p>
+      <w:pPr>
+        <w:rPr>
+          <w:lang w:val="en-US"/>
+        </w:rPr>
+      </w:pPr>
+      <w:r>
+        <w:rPr>
+          <w:lang w:val="en-US"/>
+        </w:rPr>
+        <w:t>C:\ml\L4&gt;python p5.py</w:t>
+      </w:r>
+    </w:p>
+    <w:p>
+      <w:pPr>
+        <w:rPr>
+          <w:lang w:val="en-US"/>
+        </w:rPr>
+      </w:pPr>
+      <w:r>
+        <w:rPr>
+          <w:lang w:val="en-US"/>
+        </w:rPr>
+        <w:t>Student_ID        0</w:t>
+      </w:r>
+    </w:p>
+    <w:p>
+      <w:pPr>
+        <w:rPr>
+          <w:lang w:val="en-US"/>
+        </w:rPr>
+      </w:pPr>
+      <w:r>
+        <w:rPr>
+          <w:lang w:val="en-US"/>
+        </w:rPr>
+        <w:t>Gender           10</w:t>
+      </w:r>
+    </w:p>
+    <w:p>
+      <w:pPr>
+        <w:rPr>
+          <w:lang w:val="en-US"/>
+        </w:rPr>
+      </w:pPr>
+      <w:r>
+        <w:rPr>
+          <w:lang w:val="en-US"/>
+        </w:rPr>
+        <w:t>Attendance       10</w:t>
+      </w:r>
+    </w:p>
+    <w:p>
+      <w:pPr>
+        <w:rPr>
+          <w:lang w:val="en-US"/>
+        </w:rPr>
+      </w:pPr>
+      <w:r>
+        <w:rPr>
+          <w:lang w:val="en-US"/>
+        </w:rPr>
+        <w:t>Math_Marks        2</w:t>
+      </w:r>
+    </w:p>
+    <w:p>
+      <w:pPr>
+        <w:rPr>
+          <w:lang w:val="en-US"/>
+        </w:rPr>
+      </w:pPr>
+      <w:r>
+        <w:rPr>
+          <w:lang w:val="en-US"/>
+        </w:rPr>
+        <w:t>English_Marks     2</w:t>
+      </w:r>
+    </w:p>
+    <w:p>
+      <w:pPr>
+        <w:rPr>
+          <w:lang w:val="en-US"/>
+        </w:rPr>
+      </w:pPr>
+      <w:r>
+        <w:rPr>
+          <w:lang w:val="en-US"/>
+        </w:rPr>
+        <w:t>Family_Income     0</w:t>
+      </w:r>
+    </w:p>
+    <w:p>
+      <w:pPr>
+        <w:rPr>
+          <w:lang w:val="en-US"/>
+        </w:rPr>
+      </w:pPr>
+      <w:r>
+        <w:rPr>
+          <w:lang w:val="en-US"/>
+        </w:rPr>
+        <w:t>dtype: int64</w:t>
+      </w:r>
+    </w:p>
+    <w:p>
+      <w:pPr>
+        <w:rPr>
+          <w:lang w:val="en-US"/>
+        </w:rPr>
+      </w:pPr>
+      <w:r>
+        <w:rPr>
+          <w:lang w:val="en-US"/>
+        </w:rPr>
+        <w:t>Student_ID        0</w:t>
+      </w:r>
+    </w:p>
+    <w:p>
+      <w:pPr>
+        <w:rPr>
+          <w:lang w:val="en-US"/>
+        </w:rPr>
+      </w:pPr>
+      <w:r>
+        <w:rPr>
+          <w:lang w:val="en-US"/>
+        </w:rPr>
+        <w:t>Gender            0</w:t>
+      </w:r>
+    </w:p>
+    <w:p>
+      <w:pPr>
+        <w:rPr>
+          <w:lang w:val="en-US"/>
+        </w:rPr>
+      </w:pPr>
+      <w:r>
+        <w:rPr>
+          <w:lang w:val="en-US"/>
+        </w:rPr>
+        <w:t>Attendance       10</w:t>
+      </w:r>
+    </w:p>
+    <w:p>
+      <w:pPr>
+        <w:rPr>
+          <w:lang w:val="en-US"/>
+        </w:rPr>
+      </w:pPr>
+      <w:r>
+        <w:rPr>
+          <w:lang w:val="en-US"/>
+        </w:rPr>
+        <w:t>Math_Marks        2</w:t>
+      </w:r>
+    </w:p>
+    <w:p>
+      <w:pPr>
+        <w:rPr>
+          <w:lang w:val="en-US"/>
+        </w:rPr>
+      </w:pPr>
+      <w:r>
+        <w:rPr>
+          <w:lang w:val="en-US"/>
+        </w:rPr>
+        <w:t>English_Marks     2</w:t>
+      </w:r>
+    </w:p>
+    <w:p>
+      <w:pPr>
+        <w:rPr>
+          <w:lang w:val="en-US"/>
+        </w:rPr>
+      </w:pPr>
+      <w:r>
+        <w:rPr>
+          <w:lang w:val="en-US"/>
+        </w:rPr>
+        <w:t>Family_Income     0</w:t>
+      </w:r>
+    </w:p>
+    <w:p>
+      <w:pPr>
+        <w:rPr>
+          <w:lang w:val="en-US"/>
+        </w:rPr>
+      </w:pPr>
+      <w:r>
+        <w:rPr>
+          <w:lang w:val="en-US"/>
+        </w:rPr>
+        <w:t>dtype: int64</w:t>
+      </w:r>
+    </w:p>
+    <w:p>
+      <w:pPr>
+        <w:rPr>
+          <w:lang w:val="en-US"/>
+        </w:rPr>
+      </w:pPr>
+      <w:r>
+        <w:rPr>
+          <w:lang w:val="en-US"/>
+        </w:rPr>
+        <w:t>0.31857123447167296</w:t>
+      </w:r>
+    </w:p>
+    <w:p>
+      <w:pPr>
+        <w:rPr>
+          <w:lang w:val="en-US"/>
+        </w:rPr>
+      </w:pPr>
+      <w:r>
+        <w:rPr>
+          <w:lang w:val="en-US"/>
+        </w:rPr>
+        <w:lastRenderedPageBreak/>
+        <w:t>Student_ID        0</w:t>
+      </w:r>
+    </w:p>
+    <w:p>
+      <w:pPr>
+        <w:rPr>
+          <w:lang w:val="en-US"/>
+        </w:rPr>
+      </w:pPr>
+      <w:r>
+        <w:rPr>
+          <w:lang w:val="en-US"/>
+        </w:rPr>
+        <w:t>Gender            0</w:t>
+      </w:r>
+    </w:p>
+    <w:p>
+      <w:pPr>
+        <w:rPr>
+          <w:lang w:val="en-US"/>
+        </w:rPr>
+      </w:pPr>
+      <w:r>
+        <w:rPr>
+          <w:lang w:val="en-US"/>
+        </w:rPr>
+        <w:t>Attendance       10</w:t>
+      </w:r>
+    </w:p>
+    <w:p>
+      <w:pPr>
+        <w:rPr>
+          <w:lang w:val="en-US"/>
+        </w:rPr>
+      </w:pPr>
+      <w:r>
+        <w:rPr>
+          <w:lang w:val="en-US"/>
+        </w:rPr>
+        <w:t>Math_Marks        0</w:t>
+      </w:r>
+    </w:p>
+    <w:p>
+      <w:pPr>
+        <w:rPr>
+          <w:lang w:val="en-US"/>
+        </w:rPr>
+      </w:pPr>
+      <w:r>
+        <w:rPr>
+          <w:lang w:val="en-US"/>
+        </w:rPr>
+        <w:t>English_Marks     2</w:t>
+      </w:r>
+    </w:p>
+    <w:p>
+      <w:pPr>
+        <w:rPr>
+          <w:lang w:val="en-US"/>
+        </w:rPr>
+      </w:pPr>
+      <w:r>
+        <w:rPr>
+          <w:lang w:val="en-US"/>
+        </w:rPr>
+        <w:t>Family_Income     0</w:t>
+      </w:r>
+    </w:p>
+    <w:p>
+      <w:pPr>
+        <w:rPr>
+          <w:lang w:val="en-US"/>
+        </w:rPr>
+      </w:pPr>
+      <w:r>
+        <w:rPr>
+          <w:lang w:val="en-US"/>
+        </w:rPr>
+        <w:t>dtype: int64</w:t>
+      </w:r>
+    </w:p>
+    <w:p>
+      <w:pPr>
+        <w:rPr>
+          <w:lang w:val="en-US"/>
+        </w:rPr>
+      </w:pPr>
+      <w:r>
+        <w:rPr>
+          <w:lang w:val="en-US"/>
+        </w:rPr>
+        <w:t>0.20088784434821405</w:t>
+      </w:r>
+    </w:p>
+    <w:p>
+      <w:pPr>
+        <w:rPr>
+          <w:lang w:val="en-US"/>
+        </w:rPr>
+      </w:pPr>
+      <w:r>
+        <w:rPr>
+          <w:lang w:val="en-US"/>
+        </w:rPr>
+        <w:t>Student_ID        0</w:t>
+      </w:r>
+    </w:p>
+    <w:p>
+      <w:pPr>
+        <w:rPr>
+          <w:lang w:val="en-US"/>
+        </w:rPr>
+      </w:pPr>
+      <w:r>
+        <w:rPr>
+          <w:lang w:val="en-US"/>
+        </w:rPr>
+        <w:t>Gender            0</w:t>
+      </w:r>
+    </w:p>
+    <w:p>
+      <w:pPr>
+        <w:rPr>
+          <w:lang w:val="en-US"/>
+        </w:rPr>
+      </w:pPr>
+      <w:r>
+        <w:rPr>
+          <w:lang w:val="en-US"/>
+        </w:rPr>
+        <w:t>Attendance       10</w:t>
+      </w:r>
+    </w:p>
+    <w:p>
+      <w:pPr>
+        <w:rPr>
+          <w:lang w:val="en-US"/>
+        </w:rPr>
+      </w:pPr>
+      <w:r>
+        <w:rPr>
+          <w:lang w:val="en-US"/>
+        </w:rPr>
+        <w:t>Math_Marks        0</w:t>
+      </w:r>
+    </w:p>
+    <w:p>
+      <w:pPr>
+        <w:rPr>
+          <w:lang w:val="en-US"/>
+        </w:rPr>
+      </w:pPr>
+      <w:r>
+        <w:rPr>
+          <w:lang w:val="en-US"/>
+        </w:rPr>
+        <w:t>English_Marks     0</w:t>
+      </w:r>
+    </w:p>
+    <w:p>
+      <w:pPr>
+        <w:rPr>
+          <w:lang w:val="en-US"/>
+        </w:rPr>
+      </w:pPr>
+      <w:r>
+        <w:rPr>
+          <w:lang w:val="en-US"/>
+        </w:rPr>
+        <w:t>Family_Income     0</w:t>
+      </w:r>
+    </w:p>
+    <w:p>
+      <w:pPr>
+        <w:rPr>
+          <w:lang w:val="en-US"/>
+        </w:rPr>
+      </w:pPr>
+      <w:r>
+        <w:rPr>
+          <w:lang w:val="en-US"/>
+        </w:rPr>
+        <w:t>dtype: int64</w:t>
+      </w:r>
+    </w:p>
+    <w:p>
+      <w:pPr>
+        <w:rPr>
+          <w:lang w:val="en-US"/>
+        </w:rPr>
+      </w:pPr>
+      <w:r>
+        <w:rPr>
+          <w:lang w:val="en-US"/>
+        </w:rPr>
+        <w:t>-0.05915705723030182</w:t>
+      </w:r>
+    </w:p>
+    <w:p>
+      <w:pPr>
+        <w:rPr>
+          <w:lang w:val="en-US"/>
+        </w:rPr>
+      </w:pPr>
+      <w:r>
+        <w:rPr>
+          <w:lang w:val="en-US"/>
+        </w:rPr>
+        <w:t>Student_ID       0</w:t>
+      </w:r>
+    </w:p>
+    <w:p>
+      <w:pPr>
+        <w:rPr>
+          <w:lang w:val="en-US"/>
+        </w:rPr>
+      </w:pPr>
+      <w:r>
+        <w:rPr>
+          <w:lang w:val="en-US"/>
+        </w:rPr>
+        <w:t>Gender           0</w:t>
+      </w:r>
+    </w:p>
+    <w:p>
+      <w:pPr>
+        <w:rPr>
+          <w:lang w:val="en-US"/>
+        </w:rPr>
+      </w:pPr>
+      <w:r>
+        <w:rPr>
+          <w:lang w:val="en-US"/>
+        </w:rPr>
+        <w:t>Attendance       0</w:t>
+      </w:r>
+    </w:p>
+    <w:p>
+      <w:pPr>
+        <w:rPr>
+          <w:lang w:val="en-US"/>
+        </w:rPr>
+      </w:pPr>
+      <w:r>
+        <w:rPr>
+          <w:lang w:val="en-US"/>
+        </w:rPr>
+        <w:t>Math_Marks       0</w:t>
+      </w:r>
+    </w:p>
+    <w:p>
+      <w:pPr>
+        <w:rPr>
+          <w:lang w:val="en-US"/>
+        </w:rPr>
+      </w:pPr>
+      <w:r>
+        <w:rPr>
+          <w:lang w:val="en-US"/>
+        </w:rPr>
+        <w:t>English_Marks    0</w:t>
+      </w:r>
+    </w:p>
+    <w:p>
+      <w:pPr>
+        <w:rPr>
+          <w:lang w:val="en-US"/>
+        </w:rPr>
+      </w:pPr>
+      <w:r>
+        <w:rPr>
+          <w:lang w:val="en-US"/>
+        </w:rPr>
+        <w:t>Family_Income    0</w:t>
+      </w:r>
+    </w:p>
+    <w:p>
+      <w:pPr>
+        <w:rPr>
+          <w:lang w:val="en-US"/>
+        </w:rPr>
+      </w:pPr>
+      <w:r>
+        <w:rPr>
+          <w:lang w:val="en-US"/>
+        </w:rPr>
+        <w:t>dtype: int64</w:t>
+      </w:r>
+    </w:p>
+    <w:p>
+      <w:pPr>
+        <w:rPr>
+          <w:lang w:val="en-US"/>
+        </w:rPr>
+      </w:pPr>
+    </w:p>
+    <w:p>
+      <w:pPr>
+        <w:rPr>
+          <w:lang w:val="en-US"/>
+        </w:rPr>
+      </w:pPr>
+    </w:p>
+    <w:p>
+      <w:pPr>
+        <w:rPr>
+          <w:lang w:val="en-US"/>
+        </w:rPr>
+      </w:pPr>
+    </w:p>
+    <w:p>
+      <w:pPr>
+        <w:rPr>
+          <w:lang w:val="en-US"/>
+        </w:rPr>
+      </w:pPr>
+    </w:p>
+    <w:p>
+      <w:pPr>
+        <w:rPr>
+          <w:lang w:val="en-US"/>
+        </w:rPr>
+      </w:pPr>
+    </w:p>
+    <w:p>
+      <w:pPr>
+        <w:rPr>
+          <w:lang w:val="en-US"/>
+        </w:rPr>
+      </w:pPr>
+    </w:p>
+    <w:p>
+      <w:pPr>
+        <w:rPr>
+          <w:lang w:val="en-US"/>
+        </w:rPr>
+      </w:pPr>
+    </w:p>
+    <w:p>
+      <w:pPr>
+        <w:rPr>
+          <w:lang w:val="en-US"/>
+        </w:rPr>
+      </w:pPr>
+    </w:p>
+    <w:p>
+      <w:pPr>
+        <w:rPr>
+          <w:b/>
+          <w:bCs/>
+          <w:lang w:val="en-US"/>
+        </w:rPr>
+      </w:pPr>
+      <w:r>
+        <w:rPr>
+          <w:b/>
+          <w:bCs/>
+          <w:lang w:val="en-US"/>
+        </w:rPr>
+        <w:lastRenderedPageBreak/>
+        <w:t>P6.py</w:t>
+      </w:r>
+    </w:p>
+    <w:p>
+      <w:pPr>
+        <w:rPr>
+          <w:lang w:val="en-US"/>
+        </w:rPr>
+      </w:pPr>
+      <w:r>
+        <w:rPr>
+          <w:lang w:val="en-US"/>
+        </w:rPr>
         <w:drawing>
-          <wp:inline distT="0" distB="0" distL="0" distR="0" wp14:anchorId="534D71FC" wp14:editId="7166DA55">
-            <wp:extent cx="5731510" cy="2694305"/>
-            <wp:effectExtent l="0" t="0" r="2540" b="0"/>
-            <wp:docPr id="2" name="Picture 2"/>
+          <wp:inline distT="0" distB="0" distL="0" distR="0" wp14:anchorId="58E14CA9" wp14:editId="769588FA">
+            <wp:extent cx="4851400" cy="4006850"/>
+            <wp:effectExtent l="0" t="0" r="6350" b="0"/>
+            <wp:docPr id="3" name="Picture 3"/>
             <wp:cNvGraphicFramePr>
               <a:graphicFrameLocks xmlns:a="http://schemas.openxmlformats.org/drawingml/2006/main" noChangeAspect="1"/>
             </wp:cNvGraphicFramePr>
@@ -229,7 +1867,7 @@
                     <pic:cNvPicPr/>
                   </pic:nvPicPr>
                   <pic:blipFill>
-                    <a:blip r:embed="rId5"/>
+                    <a:blip r:embed="rId7"/>
                     <a:stretch>
                       <a:fillRect/>
                     </a:stretch>
@@ -237,7 +1875,7 @@
                   <pic:spPr>
                     <a:xfrm>
                       <a:off x="0" y="0"/>
-                      <a:ext cx="5731510" cy="2694305"/>
+                      <a:ext cx="4851400" cy="4006850"/>
                     </a:xfrm>
                     <a:prstGeom prst="rect">
                       <a:avLst/>
@@ -260,20 +1898,6 @@
     <w:p>
       <w:pPr>
         <w:rPr>
-          <w:lang w:val="en-US"/>
-        </w:rPr>
-      </w:pPr>
-    </w:p>
-    <w:p>
-      <w:pPr>
-        <w:rPr>
-          <w:lang w:val="en-US"/>
-        </w:rPr>
-      </w:pPr>
-    </w:p>
-    <w:p>
-      <w:pPr>
-        <w:rPr>
           <w:b/>
           <w:bCs/>
           <w:lang w:val="en-US"/>
@@ -285,62 +1909,8 @@
           <w:bCs/>
           <w:lang w:val="en-US"/>
         </w:rPr>
-        <w:t>P4.py</w:t>
-      </w:r>
-    </w:p>
-    <w:p>
-      <w:pPr>
-        <w:rPr>
-          <w:lang w:val="en-US"/>
-        </w:rPr>
-      </w:pPr>
-      <w:r>
-        <w:rPr>
-          <w:lang w:val="en-US"/>
-        </w:rPr>
-        <w:t>C:\ml\L1&gt;python p4.py</w:t>
-      </w:r>
-    </w:p>
-    <w:p>
-      <w:pPr>
-        <w:rPr>
-          <w:lang w:val="en-US"/>
-        </w:rPr>
-      </w:pPr>
-      <w:r>
-        <w:rPr>
-          <w:lang w:val="en-US"/>
-        </w:rPr>
-        <w:t>Enter Area 4.5</w:t>
-      </w:r>
-    </w:p>
-    <w:p>
-      <w:pPr>
-        <w:rPr>
-          <w:lang w:val="en-US"/>
-        </w:rPr>
-      </w:pPr>
-      <w:r>
-        <w:rPr>
-          <w:lang w:val="en-US"/>
-        </w:rPr>
-        <w:t xml:space="preserve">price </w:t>
-      </w:r>
-      <w:proofErr w:type="gramStart"/>
-      <w:r>
-        <w:rPr>
-          <w:lang w:val="en-US"/>
-        </w:rPr>
-        <w:t>=  7.8690068493150696</w:t>
-      </w:r>
-      <w:proofErr w:type="gramEnd"/>
-    </w:p>
-    <w:p>
-      <w:pPr>
-        <w:rPr>
-          <w:lang w:val="en-US"/>
-        </w:rPr>
-      </w:pPr>
+        <w:t>P7.py</w:t>
+      </w:r>
     </w:p>
     <w:p>
       <w:pPr>
@@ -356,71 +1926,310 @@
           <w:bCs/>
           <w:lang w:val="en-US"/>
         </w:rPr>
-        <w:t>P5.py</w:t>
-      </w:r>
-    </w:p>
-    <w:p>
-      <w:pPr>
-        <w:rPr>
-          <w:lang w:val="en-US"/>
-        </w:rPr>
-      </w:pPr>
-      <w:r>
-        <w:rPr>
-          <w:lang w:val="en-US"/>
-        </w:rPr>
-        <w:t>C:\ml\L1&gt;python p5.py</w:t>
-      </w:r>
-    </w:p>
-    <w:p>
-      <w:pPr>
-        <w:rPr>
-          <w:lang w:val="en-US"/>
-        </w:rPr>
-      </w:pPr>
-      <w:proofErr w:type="spellStart"/>
-      <w:r>
-        <w:rPr>
-          <w:lang w:val="en-US"/>
-        </w:rPr>
-        <w:t>bO</w:t>
-      </w:r>
-      <w:proofErr w:type="spellEnd"/>
-      <w:r>
-        <w:rPr>
-          <w:lang w:val="en-US"/>
-        </w:rPr>
-        <w:t xml:space="preserve"> </w:t>
-      </w:r>
-      <w:proofErr w:type="gramStart"/>
-      <w:r>
-        <w:rPr>
-          <w:lang w:val="en-US"/>
-        </w:rPr>
-        <w:t>=  1.8972602739726012</w:t>
-      </w:r>
-      <w:proofErr w:type="gramEnd"/>
-    </w:p>
-    <w:p>
-      <w:pPr>
-        <w:rPr>
-          <w:lang w:val="en-US"/>
-        </w:rPr>
-      </w:pPr>
-      <w:r>
-        <w:rPr>
-          <w:lang w:val="en-US"/>
-        </w:rPr>
-        <w:t xml:space="preserve">b1 </w:t>
-      </w:r>
-      <w:proofErr w:type="gramStart"/>
-      <w:r>
-        <w:rPr>
-          <w:lang w:val="en-US"/>
-        </w:rPr>
-        <w:t>=  1.3270547945205484</w:t>
-      </w:r>
-      <w:proofErr w:type="gramEnd"/>
+        <w:drawing>
+          <wp:inline distT="0" distB="0" distL="0" distR="0" wp14:anchorId="6F0296CD" wp14:editId="19AC05E1">
+            <wp:extent cx="4800600" cy="3797300"/>
+            <wp:effectExtent l="0" t="0" r="0" b="0"/>
+            <wp:docPr id="4" name="Picture 4"/>
+            <wp:cNvGraphicFramePr>
+              <a:graphicFrameLocks xmlns:a="http://schemas.openxmlformats.org/drawingml/2006/main" noChangeAspect="1"/>
+            </wp:cNvGraphicFramePr>
+            <a:graphic xmlns:a="http://schemas.openxmlformats.org/drawingml/2006/main">
+              <a:graphicData uri="http://schemas.openxmlformats.org/drawingml/2006/picture">
+                <pic:pic xmlns:pic="http://schemas.openxmlformats.org/drawingml/2006/picture">
+                  <pic:nvPicPr>
+                    <pic:cNvPr id="1" name=""/>
+                    <pic:cNvPicPr/>
+                  </pic:nvPicPr>
+                  <pic:blipFill>
+                    <a:blip r:embed="rId8"/>
+                    <a:stretch>
+                      <a:fillRect/>
+                    </a:stretch>
+                  </pic:blipFill>
+                  <pic:spPr>
+                    <a:xfrm>
+                      <a:off x="0" y="0"/>
+                      <a:ext cx="4800600" cy="3797300"/>
+                    </a:xfrm>
+                    <a:prstGeom prst="rect">
+                      <a:avLst/>
+                    </a:prstGeom>
+                  </pic:spPr>
+                </pic:pic>
+              </a:graphicData>
+            </a:graphic>
+          </wp:inline>
+        </w:drawing>
+      </w:r>
+    </w:p>
+    <w:p>
+      <w:pPr>
+        <w:rPr>
+          <w:lang w:val="en-US"/>
+        </w:rPr>
+      </w:pPr>
+      <w:r>
+        <w:rPr>
+          <w:lang w:val="en-US"/>
+        </w:rPr>
+        <w:lastRenderedPageBreak/>
+        <w:t>C:\ml\L4&gt;python p7.py</w:t>
+      </w:r>
+    </w:p>
+    <w:p>
+      <w:pPr>
+        <w:rPr>
+          <w:lang w:val="en-US"/>
+        </w:rPr>
+      </w:pPr>
+      <w:r>
+        <w:rPr>
+          <w:lang w:val="en-US"/>
+        </w:rPr>
+        <w:t xml:space="preserve">    Experience (years)  Salary (thousands of dollars)</w:t>
+      </w:r>
+    </w:p>
+    <w:p>
+      <w:pPr>
+        <w:rPr>
+          <w:lang w:val="en-US"/>
+        </w:rPr>
+      </w:pPr>
+      <w:r>
+        <w:rPr>
+          <w:lang w:val="en-US"/>
+        </w:rPr>
+        <w:t>0                  6.0                     276.983989</w:t>
+      </w:r>
+    </w:p>
+    <w:p>
+      <w:pPr>
+        <w:rPr>
+          <w:lang w:val="en-US"/>
+        </w:rPr>
+      </w:pPr>
+      <w:r>
+        <w:rPr>
+          <w:lang w:val="en-US"/>
+        </w:rPr>
+        <w:t>1                 19.0                     788.283712</w:t>
+      </w:r>
+    </w:p>
+    <w:p>
+      <w:pPr>
+        <w:rPr>
+          <w:lang w:val="en-US"/>
+        </w:rPr>
+      </w:pPr>
+      <w:r>
+        <w:rPr>
+          <w:lang w:val="en-US"/>
+        </w:rPr>
+        <w:t>2                 28.0                    1140.928134</w:t>
+      </w:r>
+    </w:p>
+    <w:p>
+      <w:pPr>
+        <w:rPr>
+          <w:lang w:val="en-US"/>
+        </w:rPr>
+      </w:pPr>
+      <w:r>
+        <w:rPr>
+          <w:lang w:val="en-US"/>
+        </w:rPr>
+        <w:t>3                 14.0                     601.886257</w:t>
+      </w:r>
+    </w:p>
+    <w:p>
+      <w:pPr>
+        <w:rPr>
+          <w:lang w:val="en-US"/>
+        </w:rPr>
+      </w:pPr>
+      <w:r>
+        <w:rPr>
+          <w:lang w:val="en-US"/>
+        </w:rPr>
+        <w:t>4                 10.0                     437.855321</w:t>
+      </w:r>
+    </w:p>
+    <w:p>
+      <w:pPr>
+        <w:rPr>
+          <w:lang w:val="en-US"/>
+        </w:rPr>
+      </w:pPr>
+      <w:r>
+        <w:rPr>
+          <w:lang w:val="en-US"/>
+        </w:rPr>
+        <w:t>..                 ...                            ...</w:t>
+      </w:r>
+    </w:p>
+    <w:p>
+      <w:pPr>
+        <w:rPr>
+          <w:lang w:val="en-US"/>
+        </w:rPr>
+      </w:pPr>
+      <w:r>
+        <w:rPr>
+          <w:lang w:val="en-US"/>
+        </w:rPr>
+        <w:t>95                 NaN                    1143.809306</w:t>
+      </w:r>
+    </w:p>
+    <w:p>
+      <w:pPr>
+        <w:rPr>
+          <w:lang w:val="en-US"/>
+        </w:rPr>
+      </w:pPr>
+      <w:r>
+        <w:rPr>
+          <w:lang w:val="en-US"/>
+        </w:rPr>
+        <w:t>96                17.0                     713.561598</w:t>
+      </w:r>
+    </w:p>
+    <w:p>
+      <w:pPr>
+        <w:rPr>
+          <w:lang w:val="en-US"/>
+        </w:rPr>
+      </w:pPr>
+      <w:r>
+        <w:rPr>
+          <w:lang w:val="en-US"/>
+        </w:rPr>
+        <w:t>97                25.0                    1029.781191</w:t>
+      </w:r>
+    </w:p>
+    <w:p>
+      <w:pPr>
+        <w:rPr>
+          <w:lang w:val="en-US"/>
+        </w:rPr>
+      </w:pPr>
+      <w:r>
+        <w:rPr>
+          <w:lang w:val="en-US"/>
+        </w:rPr>
+        <w:t>98                11.0                     482.180504</w:t>
+      </w:r>
+    </w:p>
+    <w:p>
+      <w:pPr>
+        <w:rPr>
+          <w:lang w:val="en-US"/>
+        </w:rPr>
+      </w:pPr>
+      <w:r>
+        <w:rPr>
+          <w:lang w:val="en-US"/>
+        </w:rPr>
+        <w:t>99                 1.0                      66.105420</w:t>
+      </w:r>
+    </w:p>
+    <w:p>
+      <w:pPr>
+        <w:rPr>
+          <w:lang w:val="en-US"/>
+        </w:rPr>
+      </w:pPr>
+    </w:p>
+    <w:p>
+      <w:pPr>
+        <w:rPr>
+          <w:lang w:val="en-US"/>
+        </w:rPr>
+      </w:pPr>
+      <w:r>
+        <w:rPr>
+          <w:lang w:val="en-US"/>
+        </w:rPr>
+        <w:t>[100 rows x 2 columns]</w:t>
+      </w:r>
+    </w:p>
+    <w:p>
+      <w:pPr>
+        <w:rPr>
+          <w:lang w:val="en-US"/>
+        </w:rPr>
+      </w:pPr>
+      <w:r>
+        <w:rPr>
+          <w:lang w:val="en-US"/>
+        </w:rPr>
+        <w:t>Experience (years)               0</w:t>
+      </w:r>
+    </w:p>
+    <w:p>
+      <w:pPr>
+        <w:rPr>
+          <w:lang w:val="en-US"/>
+        </w:rPr>
+      </w:pPr>
+      <w:r>
+        <w:rPr>
+          <w:lang w:val="en-US"/>
+        </w:rPr>
+        <w:t>Salary (thousands of dollars)    0</w:t>
+      </w:r>
+    </w:p>
+    <w:p>
+      <w:pPr>
+        <w:rPr>
+          <w:lang w:val="en-US"/>
+        </w:rPr>
+      </w:pPr>
+      <w:r>
+        <w:rPr>
+          <w:lang w:val="en-US"/>
+        </w:rPr>
+        <w:t>dtype: int64</w:t>
+      </w:r>
+    </w:p>
+    <w:p>
+      <w:pPr>
+        <w:rPr>
+          <w:lang w:val="en-US"/>
+        </w:rPr>
+      </w:pPr>
+      <w:r>
+        <w:rPr>
+          <w:lang w:val="en-US"/>
+        </w:rPr>
+        <w:t>0.8795068531727668</w:t>
+      </w:r>
+    </w:p>
+    <w:p>
+      <w:pPr>
+        <w:rPr>
+          <w:lang w:val="en-US"/>
+        </w:rPr>
+      </w:pPr>
+      <w:r>
+        <w:rPr>
+          <w:lang w:val="en-US"/>
+        </w:rPr>
+        <w:t>enter exp in year 3</w:t>
+      </w:r>
+    </w:p>
+    <w:p>
+      <w:pPr>
+        <w:rPr>
+          <w:lang w:val="en-US"/>
+        </w:rPr>
+      </w:pPr>
+      <w:r>
+        <w:rPr>
+          <w:lang w:val="en-US"/>
+        </w:rPr>
+        <w:t>[203.31151883]</w:t>
+      </w:r>
     </w:p>
     <w:p>
       <w:pPr>
@@ -443,84 +2252,160 @@
           <w:bCs/>
           <w:lang w:val="en-US"/>
         </w:rPr>
-        <w:t>P6.py</w:t>
-      </w:r>
-    </w:p>
-    <w:p>
-      <w:pPr>
-        <w:rPr>
-          <w:lang w:val="en-US"/>
-        </w:rPr>
-      </w:pPr>
-      <w:r>
-        <w:rPr>
-          <w:lang w:val="en-US"/>
-        </w:rPr>
-        <w:t>C:\ml\L1&gt;python p6.py</w:t>
-      </w:r>
-    </w:p>
-    <w:p>
-      <w:pPr>
-        <w:rPr>
-          <w:lang w:val="en-US"/>
-        </w:rPr>
-      </w:pPr>
-      <w:r>
-        <w:rPr>
-          <w:lang w:val="en-US"/>
-        </w:rPr>
-        <w:t>99.05 %</w:t>
-      </w:r>
-    </w:p>
-    <w:p>
-      <w:pPr>
-        <w:rPr>
-          <w:lang w:val="en-US"/>
-        </w:rPr>
-      </w:pPr>
-      <w:r>
-        <w:rPr>
-          <w:lang w:val="en-US"/>
-        </w:rPr>
-        <w:t>enter area 5</w:t>
-      </w:r>
-    </w:p>
-    <w:p>
-      <w:pPr>
-        <w:rPr>
-          <w:lang w:val="en-US"/>
-        </w:rPr>
-      </w:pPr>
-      <w:r>
-        <w:rPr>
-          <w:lang w:val="en-US"/>
-        </w:rPr>
-        <w:t xml:space="preserve">8.59 </w:t>
-      </w:r>
-      <w:proofErr w:type="spellStart"/>
-      <w:r>
-        <w:rPr>
-          <w:lang w:val="en-US"/>
-        </w:rPr>
-        <w:t>crs</w:t>
-      </w:r>
-      <w:proofErr w:type="spellEnd"/>
-    </w:p>
-    <w:p>
-      <w:pPr>
-        <w:rPr>
-          <w:lang w:val="en-US"/>
-        </w:rPr>
-      </w:pPr>
+        <w:t>P8.py</w:t>
+      </w:r>
+    </w:p>
+    <w:p>
+      <w:pPr>
+        <w:rPr>
+          <w:lang w:val="en-US"/>
+        </w:rPr>
+      </w:pPr>
+      <w:r>
+        <w:rPr>
+          <w:lang w:val="en-US"/>
+        </w:rPr>
+        <w:t>C:\ml\L4&gt;python p8.py</w:t>
+      </w:r>
+      <w:bookmarkStart w:id="0" w:name="_GoBack"/>
+    </w:p>
+    <w:bookmarkEnd w:id="0"/>
+    <w:p>
+      <w:pPr>
+        <w:rPr>
+          <w:lang w:val="en-US"/>
+        </w:rPr>
+      </w:pPr>
+      <w:r>
+        <w:rPr>
+          <w:lang w:val="en-US"/>
+        </w:rPr>
+        <w:t xml:space="preserve">   qty  price</w:t>
+      </w:r>
+    </w:p>
+    <w:p>
+      <w:pPr>
+        <w:rPr>
+          <w:lang w:val="en-US"/>
+        </w:rPr>
+      </w:pPr>
+      <w:r>
+        <w:rPr>
+          <w:lang w:val="en-US"/>
+        </w:rPr>
+        <w:t>0    1   3.50</w:t>
+      </w:r>
+    </w:p>
+    <w:p>
+      <w:pPr>
+        <w:rPr>
+          <w:lang w:val="en-US"/>
+        </w:rPr>
+      </w:pPr>
+      <w:r>
+        <w:rPr>
+          <w:lang w:val="en-US"/>
+        </w:rPr>
+        <w:t>1    2   5.00</w:t>
+      </w:r>
+    </w:p>
+    <w:p>
+      <w:pPr>
+        <w:rPr>
+          <w:lang w:val="en-US"/>
+        </w:rPr>
+      </w:pPr>
+      <w:r>
+        <w:rPr>
+          <w:lang w:val="en-US"/>
+        </w:rPr>
+        <w:t>2    3   6.50</w:t>
+      </w:r>
+    </w:p>
+    <w:p>
+      <w:pPr>
+        <w:rPr>
+          <w:lang w:val="en-US"/>
+        </w:rPr>
+      </w:pPr>
+      <w:r>
+        <w:rPr>
+          <w:lang w:val="en-US"/>
+        </w:rPr>
+        <w:t>3    4   5.75</w:t>
+      </w:r>
+    </w:p>
+    <w:p>
+      <w:pPr>
+        <w:rPr>
+          <w:lang w:val="en-US"/>
+        </w:rPr>
+      </w:pPr>
+      <w:r>
+        <w:rPr>
+          <w:lang w:val="en-US"/>
+        </w:rPr>
+        <w:t>4    5   9.00</w:t>
+      </w:r>
     </w:p>
     <w:sectPr>
       <w:pgSz w:w="11906" w:h="16838"/>
-      <w:pgMar w:top="1440" w:right="1440" w:bottom="1440" w:left="1440" w:header="708" w:footer="708" w:gutter="0"/>
+      <w:pgMar w:top="1350" w:right="1440" w:bottom="1440" w:left="1440" w:header="708" w:footer="708" w:gutter="0"/>
       <w:cols w:space="708"/>
       <w:docGrid w:linePitch="360"/>
     </w:sectPr>
   </w:body>
 </w:document>
+</file>
+
+<file path=word/endnotes.xml><?xml version="1.0" encoding="utf-8"?>
+<w:endnotes xmlns:wpc="http://schemas.microsoft.com/office/word/2010/wordprocessingCanvas" xmlns:cx="http://schemas.microsoft.com/office/drawing/2014/chartex" xmlns:cx1="http://schemas.microsoft.com/office/drawing/2015/9/8/chartex" xmlns:mc="http://schemas.openxmlformats.org/markup-compatibility/2006" xmlns:o="urn:schemas-microsoft-com:office:office" xmlns:r="http://schemas.openxmlformats.org/officeDocument/2006/relationships" xmlns:m="http://schemas.openxmlformats.org/officeDocument/2006/math" xmlns:v="urn:schemas-microsoft-com:vml" xmlns:wp14="http://schemas.microsoft.com/office/word/2010/wordprocessingDrawing" xmlns:wp="http://schemas.openxmlformats.org/drawingml/2006/wordprocessingDrawing" xmlns:w10="urn:schemas-microsoft-com:office:word" xmlns:w="http://schemas.openxmlformats.org/wordprocessingml/2006/main" xmlns:w14="http://schemas.microsoft.com/office/word/2010/wordml" xmlns:w15="http://schemas.microsoft.com/office/word/2012/wordml" xmlns:w16se="http://schemas.microsoft.com/office/word/2015/wordml/symex" xmlns:wpg="http://schemas.microsoft.com/office/word/2010/wordprocessingGroup" xmlns:wpi="http://schemas.microsoft.com/office/word/2010/wordprocessingInk" xmlns:wne="http://schemas.microsoft.com/office/word/2006/wordml" xmlns:wps="http://schemas.microsoft.com/office/word/2010/wordprocessingShape" mc:Ignorable="w14 w15 w16se wp14">
+  <w:endnote w:type="separator" w:id="-1">
+    <w:p>
+      <w:pPr>
+        <w:spacing w:after="0" w:line="240" w:lineRule="auto"/>
+      </w:pPr>
+      <w:r>
+        <w:separator/>
+      </w:r>
+    </w:p>
+  </w:endnote>
+  <w:endnote w:type="continuationSeparator" w:id="0">
+    <w:p>
+      <w:pPr>
+        <w:spacing w:after="0" w:line="240" w:lineRule="auto"/>
+      </w:pPr>
+      <w:r>
+        <w:continuationSeparator/>
+      </w:r>
+    </w:p>
+  </w:endnote>
+</w:endnotes>
+</file>
+
+<file path=word/footnotes.xml><?xml version="1.0" encoding="utf-8"?>
+<w:footnotes xmlns:wpc="http://schemas.microsoft.com/office/word/2010/wordprocessingCanvas" xmlns:cx="http://schemas.microsoft.com/office/drawing/2014/chartex" xmlns:cx1="http://schemas.microsoft.com/office/drawing/2015/9/8/chartex" xmlns:mc="http://schemas.openxmlformats.org/markup-compatibility/2006" xmlns:o="urn:schemas-microsoft-com:office:office" xmlns:r="http://schemas.openxmlformats.org/officeDocument/2006/relationships" xmlns:m="http://schemas.openxmlformats.org/officeDocument/2006/math" xmlns:v="urn:schemas-microsoft-com:vml" xmlns:wp14="http://schemas.microsoft.com/office/word/2010/wordprocessingDrawing" xmlns:wp="http://schemas.openxmlformats.org/drawingml/2006/wordprocessingDrawing" xmlns:w10="urn:schemas-microsoft-com:office:word" xmlns:w="http://schemas.openxmlformats.org/wordprocessingml/2006/main" xmlns:w14="http://schemas.microsoft.com/office/word/2010/wordml" xmlns:w15="http://schemas.microsoft.com/office/word/2012/wordml" xmlns:w16se="http://schemas.microsoft.com/office/word/2015/wordml/symex" xmlns:wpg="http://schemas.microsoft.com/office/word/2010/wordprocessingGroup" xmlns:wpi="http://schemas.microsoft.com/office/word/2010/wordprocessingInk" xmlns:wne="http://schemas.microsoft.com/office/word/2006/wordml" xmlns:wps="http://schemas.microsoft.com/office/word/2010/wordprocessingShape" mc:Ignorable="w14 w15 w16se wp14">
+  <w:footnote w:type="separator" w:id="-1">
+    <w:p>
+      <w:pPr>
+        <w:spacing w:after="0" w:line="240" w:lineRule="auto"/>
+      </w:pPr>
+      <w:r>
+        <w:separator/>
+      </w:r>
+    </w:p>
+  </w:footnote>
+  <w:footnote w:type="continuationSeparator" w:id="0">
+    <w:p>
+      <w:pPr>
+        <w:spacing w:after="0" w:line="240" w:lineRule="auto"/>
+      </w:pPr>
+      <w:r>
+        <w:continuationSeparator/>
+      </w:r>
+    </w:p>
+  </w:footnote>
+</w:footnotes>
 </file>
 
 <file path=word/styles.xml><?xml version="1.0" encoding="utf-8"?>
@@ -944,6 +2829,50 @@
     <w:semiHidden/>
     <w:unhideWhenUsed/>
   </w:style>
+  <w:style w:type="paragraph" w:styleId="Header">
+    <w:name w:val="header"/>
+    <w:basedOn w:val="Normal"/>
+    <w:link w:val="HeaderChar"/>
+    <w:uiPriority w:val="99"/>
+    <w:unhideWhenUsed/>
+    <w:rsid w:val="00602F94"/>
+    <w:pPr>
+      <w:tabs>
+        <w:tab w:val="center" w:pos="4513"/>
+        <w:tab w:val="right" w:pos="9026"/>
+      </w:tabs>
+      <w:spacing w:after="0" w:line="240" w:lineRule="auto"/>
+    </w:pPr>
+  </w:style>
+  <w:style w:type="character" w:customStyle="1" w:styleId="HeaderChar">
+    <w:name w:val="Header Char"/>
+    <w:basedOn w:val="DefaultParagraphFont"/>
+    <w:link w:val="Header"/>
+    <w:uiPriority w:val="99"/>
+    <w:rsid w:val="00602F94"/>
+  </w:style>
+  <w:style w:type="paragraph" w:styleId="Footer">
+    <w:name w:val="footer"/>
+    <w:basedOn w:val="Normal"/>
+    <w:link w:val="FooterChar"/>
+    <w:uiPriority w:val="99"/>
+    <w:unhideWhenUsed/>
+    <w:rsid w:val="00602F94"/>
+    <w:pPr>
+      <w:tabs>
+        <w:tab w:val="center" w:pos="4513"/>
+        <w:tab w:val="right" w:pos="9026"/>
+      </w:tabs>
+      <w:spacing w:after="0" w:line="240" w:lineRule="auto"/>
+    </w:pPr>
+  </w:style>
+  <w:style w:type="character" w:customStyle="1" w:styleId="FooterChar">
+    <w:name w:val="Footer Char"/>
+    <w:basedOn w:val="DefaultParagraphFont"/>
+    <w:link w:val="Footer"/>
+    <w:uiPriority w:val="99"/>
+    <w:rsid w:val="00602F94"/>
+  </w:style>
 </w:styles>
 </file>
 

</xml_diff>